<commit_message>
Add new 'Alternative Approaches' sheet to Excel and append references to docx
</commit_message>
<xml_diff>
--- a/ripple_counting_approaches.docx
+++ b/ripple_counting_approaches.docx
@@ -674,6 +674,180 @@
         </w:tc>
       </w:tr>
     </w:tbl>
+    <w:p>
+      <w:r>
+        <w:br w:type="page"/>
+      </w:r>
+    </w:p>
+    <w:p>
+      <w:pPr>
+        <w:pStyle w:val="Heading1"/>
+      </w:pPr>
+      <w:r>
+        <w:t>References — Related Papers</w:t>
+      </w:r>
+    </w:p>
+    <w:p>
+      <w:r>
+        <w:t>The following academic papers and references have been identified as directly relevant to the approaches described in this document.</w:t>
+      </w:r>
+    </w:p>
+    <w:p>
+      <w:pPr>
+        <w:pStyle w:val="Heading2"/>
+      </w:pPr>
+      <w:r>
+        <w:t>1. Adaptive Thresholding</w:t>
+      </w:r>
+    </w:p>
+    <w:p>
+      <w:r>
+        <w:rPr>
+          <w:b/>
+        </w:rPr>
+        <w:t>"Improving Anomaly Detection with Adaptive Dynamic Thresholding"</w:t>
+      </w:r>
+    </w:p>
+    <w:p>
+      <w:r>
+        <w:t>Karlsruhe Institute of Technology (KIT)</w:t>
+      </w:r>
+    </w:p>
+    <w:p>
+      <w:r>
+        <w:t>Link: https://publikationen.bibliothek.kit.edu/1000171877</w:t>
+      </w:r>
+    </w:p>
+    <w:p>
+      <w:pPr>
+        <w:pStyle w:val="Heading2"/>
+      </w:pPr>
+      <w:r>
+        <w:t>2. Unsupervised Anomaly Detection (VAE)</w:t>
+      </w:r>
+    </w:p>
+    <w:p>
+      <w:r>
+        <w:rPr>
+          <w:b/>
+        </w:rPr>
+        <w:t>"Unsupervised Induction Motor Anomaly Detection Using a Deep Convolutional Variational Autoencoder"</w:t>
+      </w:r>
+    </w:p>
+    <w:p>
+      <w:r>
+        <w:t>University College Cork (UCC), IEEE SMARTCOMP 2025. Authors: Visentin, Dalla, Provan-Bessell, O'Sullivan.</w:t>
+      </w:r>
+    </w:p>
+    <w:p>
+      <w:r>
+        <w:t>Link: https://research.ucc.ie/profiles/D012/andrea.visentin</w:t>
+      </w:r>
+    </w:p>
+    <w:p>
+      <w:pPr>
+        <w:pStyle w:val="Heading2"/>
+      </w:pPr>
+      <w:r>
+        <w:t>3. Self-Supervised / LSTM Autoencoder</w:t>
+      </w:r>
+    </w:p>
+    <w:p>
+      <w:r>
+        <w:rPr>
+          <w:b/>
+        </w:rPr>
+        <w:t>"LSTM Autoencoder-Based Anomaly Detection for Time Series"</w:t>
+      </w:r>
+    </w:p>
+    <w:p>
+      <w:r>
+        <w:t>Universiti Teknologi Malaysia (UTM) — Faculty of Electrical Engineering theses.</w:t>
+      </w:r>
+    </w:p>
+    <w:p>
+      <w:r>
+        <w:t>Link: https://eprints.utm.my/view/subjects/QA75.html</w:t>
+      </w:r>
+    </w:p>
+    <w:p>
+      <w:pPr>
+        <w:pStyle w:val="Heading2"/>
+      </w:pPr>
+      <w:r>
+        <w:t>4. Clustering / Unsupervised Grouping</w:t>
+      </w:r>
+    </w:p>
+    <w:p>
+      <w:r>
+        <w:rPr>
+          <w:b/>
+        </w:rPr>
+        <w:t>"Real-time anomaly detection in electric motor operation noise"</w:t>
+      </w:r>
+    </w:p>
+    <w:p>
+      <w:r>
+        <w:t>IAES International Journal of Artificial Intelligence (IJ-AI), Vol. 13, No. 4, Dec 2024, pp. 3814-3826. Authors: Nguyen, Thai, Tran, Pham, Nguyen. Uses autoencoder on spectrograms deployed on MCU with FreeRTOS.</w:t>
+      </w:r>
+    </w:p>
+    <w:p>
+      <w:r>
+        <w:t>Link: https://ijai.iaescore.com/index.php/IJAI/article/view/24218</w:t>
+      </w:r>
+    </w:p>
+    <w:p>
+      <w:pPr>
+        <w:pStyle w:val="Heading2"/>
+      </w:pPr>
+      <w:r>
+        <w:t>5. Template / Model-Guided Ripple Detection</w:t>
+      </w:r>
+    </w:p>
+    <w:p>
+      <w:r>
+        <w:rPr>
+          <w:b/>
+        </w:rPr>
+        <w:t>"Sensorless Speed Control of Brushed DC Motor Based at New Current Ripple Component Signal Processing"</w:t>
+      </w:r>
+    </w:p>
+    <w:p>
+      <w:r>
+        <w:t>MDPI Energies, 2021, Vol. 14, Article 5359. Authors: Vidlák, Gorel, Makýš, Stano. Uses a discrete bandpass filter with floating bandwidth to extract current ripple.</w:t>
+      </w:r>
+    </w:p>
+    <w:p>
+      <w:r>
+        <w:t>Link: https://doi.org/10.3390/en14175359</w:t>
+      </w:r>
+    </w:p>
+    <w:p>
+      <w:pPr>
+        <w:pStyle w:val="Heading2"/>
+      </w:pPr>
+      <w:r>
+        <w:t>6. Supervised Ripple-Pulse Classification (SVM)</w:t>
+      </w:r>
+    </w:p>
+    <w:p>
+      <w:r>
+        <w:rPr>
+          <w:b/>
+        </w:rPr>
+        <w:t>"A New Method for Sensorless Estimation of the Speed and Position in Brushed DC Motors Using Support Vector Machines"</w:t>
+      </w:r>
+    </w:p>
+    <w:p>
+      <w:r>
+        <w:t>IEEE Transactions on Industrial Electronics, Vol. 59, No. 3, March 2012, pp. 1397-1408. Authors: Vázquez-Sánchez, Gómez-Gil, Gamazo-Real, Díez-Higuera. Uses SVMs to classify real ripple pulses vs ghost/false pulses. The most directly relevant ML paper.</w:t>
+      </w:r>
+    </w:p>
+    <w:p>
+      <w:r>
+        <w:t>Link: https://arxiv.org/abs/2403.18833</w:t>
+      </w:r>
+    </w:p>
     <w:sectPr>
       <w:pgSz w:w="12240" w:h="15840"/>
       <w:pgMar w:top="1440" w:right="1800" w:bottom="1440" w:left="1800" w:header="720" w:footer="720" w:gutter="0"/>

</xml_diff>